<commit_message>
Pré-projeto: capa em preto no lugar do azul do template
O azul dos placeholders do template era marcação de "preencha aqui".
Título, disciplina e autores passam a sair em preto.

Co-Authored-By: Claude Opus 5 <noreply@anthropic.com>
Claude-Session: https://claude.ai/code/session_01EwVqaitMT7q3EF3FZ9uVHx
</commit_message>
<xml_diff>
--- a/preprojeto/entrega/IDP.INE - Pré-projeto (Avaliação Continuada) - Claudio Meireles e Felipe Dutra.docx
+++ b/preprojeto/entrega/IDP.INE - Pré-projeto (Avaliação Continuada) - Claudio Meireles e Felipe Dutra.docx
@@ -19,7 +19,7 @@
           <w:rFonts w:ascii="Calibri" w:cs="Calibri" w:eastAsia="Calibri" w:hAnsi="Calibri"/>
           <w:b w:val="1"/>
           <w:bCs w:val="1"/>
-          <w:color w:val="1155cc"/>
+          <w:color w:val="000000"/>
           <w:sz w:val="36"/>
           <w:szCs w:val="36"/>
           <w:rtl w:val="0"/>
@@ -69,7 +69,7 @@
       <w:r>
         <w:rPr>
           <w:rFonts w:ascii="Calibri" w:cs="Calibri" w:eastAsia="Calibri" w:hAnsi="Calibri"/>
-          <w:color w:val="1155cc"/>
+          <w:color w:val="000000"/>
           <w:sz w:val="32"/>
           <w:szCs w:val="32"/>
           <w:rtl w:val="0"/>
@@ -90,14 +90,14 @@
       <w:r>
         <w:rPr>
           <w:rFonts w:ascii="Calibri" w:cs="Calibri" w:eastAsia="Calibri" w:hAnsi="Calibri"/>
-          <w:color w:val="1155cc"/>
-          <w:rtl w:val="0"/>
-        </w:rPr>
-      </w:r>
-      <w:r>
-        <w:rPr>
-          <w:rFonts w:ascii="Calibri" w:cs="Calibri" w:eastAsia="Calibri" w:hAnsi="Calibri"/>
-          <w:color w:val="1155cc"/>
+          <w:color w:val="000000"/>
+          <w:rtl w:val="0"/>
+        </w:rPr>
+      </w:r>
+      <w:r>
+        <w:rPr>
+          <w:rFonts w:ascii="Calibri" w:cs="Calibri" w:eastAsia="Calibri" w:hAnsi="Calibri"/>
+          <w:color w:val="000000"/>
           <w:sz w:val="28"/>
           <w:szCs w:val="28"/>
           <w:rtl w:val="0"/>

</xml_diff>

<commit_message>
Pré-projeto: corrige o link da base de vendas da ANP
A ANP renomeou o conjunto de "vendas de derivados de petróleo e etanol"
para "vendas de derivados de petróleo e biocombustíveis", e a URL antiga
responde 404. Atualiza o link e o nome da base no documento e no README.

Co-Authored-By: Claude Opus 5 <noreply@anthropic.com>
Claude-Session: https://claude.ai/code/session_01EwVqaitMT7q3EF3FZ9uVHx
</commit_message>
<xml_diff>
--- a/preprojeto/entrega/IDP.INE - Pré-projeto (Avaliação Continuada) - Claudio Meireles e Felipe Dutra.docx
+++ b/preprojeto/entrega/IDP.INE - Pré-projeto (Avaliação Continuada) - Claudio Meireles e Felipe Dutra.docx
@@ -623,7 +623,7 @@
           <w:rFonts w:ascii="Calibri" w:cs="Calibri" w:eastAsia="Calibri" w:hAnsi="Calibri"/>
           <w:rtl w:val="0"/>
         </w:rPr>
-        <w:t>As três bases são públicas, de download livre e sem cadastro. A base principal é o Levantamento de Preços de Combustíveis da ANP, com a coleta semanal do preço praticado em postos revendedores por região, UF, município, produto, data da coleta, valor de venda e bandeira, publicada desde 2004. As outras duas entram como apoio: as vendas de derivados dão o volume mensal por UF e produto, usado para ponderar as médias de preço pelo tamanho de cada mercado; o IPCA entra como deflator, para separar alta real de combustível de inflação geral. Os arquivos da ANP também estão espelhados no Portal Brasileiro de Dados Abertos (dados.gov.br).</w:t>
+        <w:t>As três bases são públicas, de download livre e sem cadastro. A base principal é o Levantamento de Preços de Combustíveis da ANP, com a coleta semanal do preço praticado em postos revendedores por região, UF, município, produto, data da coleta, valor de venda e bandeira, publicada desde 2004. As outras duas entram como apoio: as vendas de derivados de petróleo e biocombustíveis dão o volume mensal por UF e produto, usado para ponderar as médias de preço pelo tamanho de cada mercado; o IPCA entra como deflator, para separar alta real de combustível de inflação geral. Os arquivos da ANP também estão espelhados no Portal Brasileiro de Dados Abertos (dados.gov.br).</w:t>
       </w:r>
     </w:p>
     <w:tbl>
@@ -784,7 +784,7 @@
                 <w:bCs w:val="1"/>
                 <w:rtl w:val="0"/>
               </w:rPr>
-              <w:t>ANP - Vendas de derivados de petróleo e etanol. Base de apoio (volume por UF e produto).</w:t>
+              <w:t>ANP - Vendas de derivados de petróleo e biocombustíveis. Base de apoio (volume por UF e produto).</w:t>
             </w:r>
           </w:p>
         </w:tc>
@@ -805,7 +805,7 @@
                 <w:bCs w:val="1"/>
                 <w:rtl w:val="0"/>
               </w:rPr>
-              <w:t>https://www.gov.br/anp/pt-br/centrais-de-conteudo/dados-abertos/vendas-de-derivados-de-petroleo-e-etanol</w:t>
+              <w:t>https://www.gov.br/anp/pt-br/centrais-de-conteudo/dados-abertos/vendas-de-derivados-de-petroleo-e-biocombustiveis</w:t>
             </w:r>
           </w:p>
         </w:tc>

</xml_diff>

<commit_message>
Pré-projeto: links das bases viram hyperlinks clicáveis
As URLs estavam como texto puro. Agora são hyperlinks de verdade, que
sobrevivem à conversão para PDF e abrem com um clique.

Co-Authored-By: Claude Opus 5 <noreply@anthropic.com>
Claude-Session: https://claude.ai/code/session_01EwVqaitMT7q3EF3FZ9uVHx
</commit_message>
<xml_diff>
--- a/preprojeto/entrega/IDP.INE - Pré-projeto (Avaliação Continuada) - Claudio Meireles e Felipe Dutra.docx
+++ b/preprojeto/entrega/IDP.INE - Pré-projeto (Avaliação Continuada) - Claudio Meireles e Felipe Dutra.docx
@@ -750,14 +750,18 @@
                 <w:rFonts w:ascii="Calibri" w:cs="Calibri" w:eastAsia="Calibri" w:hAnsi="Calibri"/>
               </w:rPr>
             </w:pPr>
-            <w:r>
-              <w:rPr>
-                <w:rFonts w:ascii="Calibri" w:cs="Calibri" w:eastAsia="Calibri" w:hAnsi="Calibri"/>
-                <w:bCs w:val="1"/>
-                <w:rtl w:val="0"/>
-              </w:rPr>
-              <w:t>https://www.gov.br/anp/pt-br/centrais-de-conteudo/dados-abertos/serie-historica-de-precos-de-combustiveis</w:t>
-            </w:r>
+            <w:hyperlink r:id="rId8">
+              <w:r>
+                <w:rPr>
+                  <w:rFonts w:ascii="Calibri" w:cs="Calibri" w:eastAsia="Calibri" w:hAnsi="Calibri"/>
+                  <w:bCs w:val="1"/>
+                  <w:rtl w:val="0"/>
+                  <w:color w:val="0563C1"/>
+                  <w:u w:val="single"/>
+                </w:rPr>
+                <w:t>https://www.gov.br/anp/pt-br/centrais-de-conteudo/dados-abertos/serie-historica-de-precos-de-combustiveis</w:t>
+              </w:r>
+            </w:hyperlink>
           </w:p>
         </w:tc>
       </w:tr>
@@ -799,14 +803,18 @@
                 <w:rFonts w:ascii="Calibri" w:cs="Calibri" w:eastAsia="Calibri" w:hAnsi="Calibri"/>
               </w:rPr>
             </w:pPr>
-            <w:r>
-              <w:rPr>
-                <w:rFonts w:ascii="Calibri" w:cs="Calibri" w:eastAsia="Calibri" w:hAnsi="Calibri"/>
-                <w:bCs w:val="1"/>
-                <w:rtl w:val="0"/>
-              </w:rPr>
-              <w:t>https://www.gov.br/anp/pt-br/centrais-de-conteudo/dados-abertos/vendas-de-derivados-de-petroleo-e-biocombustiveis</w:t>
-            </w:r>
+            <w:hyperlink r:id="rId9">
+              <w:r>
+                <w:rPr>
+                  <w:rFonts w:ascii="Calibri" w:cs="Calibri" w:eastAsia="Calibri" w:hAnsi="Calibri"/>
+                  <w:bCs w:val="1"/>
+                  <w:rtl w:val="0"/>
+                  <w:color w:val="0563C1"/>
+                  <w:u w:val="single"/>
+                </w:rPr>
+                <w:t>https://www.gov.br/anp/pt-br/centrais-de-conteudo/dados-abertos/vendas-de-derivados-de-petroleo-e-biocombustiveis</w:t>
+              </w:r>
+            </w:hyperlink>
           </w:p>
         </w:tc>
       </w:tr>
@@ -848,14 +856,18 @@
                 <w:rFonts w:ascii="Calibri" w:cs="Calibri" w:eastAsia="Calibri" w:hAnsi="Calibri"/>
               </w:rPr>
             </w:pPr>
-            <w:r>
-              <w:rPr>
-                <w:rFonts w:ascii="Calibri" w:cs="Calibri" w:eastAsia="Calibri" w:hAnsi="Calibri"/>
-                <w:bCs w:val="1"/>
-                <w:rtl w:val="0"/>
-              </w:rPr>
-              <w:t>https://sidra.ibge.gov.br/tabela/1737</w:t>
-            </w:r>
+            <w:hyperlink r:id="rId10">
+              <w:r>
+                <w:rPr>
+                  <w:rFonts w:ascii="Calibri" w:cs="Calibri" w:eastAsia="Calibri" w:hAnsi="Calibri"/>
+                  <w:bCs w:val="1"/>
+                  <w:rtl w:val="0"/>
+                  <w:color w:val="0563C1"/>
+                  <w:u w:val="single"/>
+                </w:rPr>
+                <w:t>https://sidra.ibge.gov.br/tabela/1737</w:t>
+              </w:r>
+            </w:hyperlink>
           </w:p>
         </w:tc>
       </w:tr>

</xml_diff>

<commit_message>
Pré-projeto: incorpora o retorno do professor
Três mudanças pedidas na devolutiva:

- Comparação entre duas capitais: o recorte sai de "nacional com abertura
  para o DF" e passa a ser Brasília x Goiânia, do preço mínimo ao máximo
  coletado em cada semana.
- Peso na renda: nova pergunta calcula que percentual da renda média
  mensal do DF e de Goiás vai para o combustível, com consumo de
  referência de 100 litros por mês. Entra a PNAD Contínua (tabela 5437)
  como quarta base de dados.
- Público-alvo explícito: o estudo passa a declarar que é feito para a
  população, o consumidor que abastece, e as perguntas são reescritas
  dessa perspectiva.

Título ajustado ao novo recorte.

Co-Authored-By: Claude Opus 5 <noreply@anthropic.com>
Claude-Session: https://claude.ai/code/session_01EwVqaitMT7q3EF3FZ9uVHx
</commit_message>
<xml_diff>
--- a/preprojeto/entrega/IDP.INE - Pré-projeto (Avaliação Continuada) - Claudio Meireles e Felipe Dutra.docx
+++ b/preprojeto/entrega/IDP.INE - Pré-projeto (Avaliação Continuada) - Claudio Meireles e Felipe Dutra.docx
@@ -24,7 +24,7 @@
           <w:szCs w:val="36"/>
           <w:rtl w:val="0"/>
         </w:rPr>
-        <w:t>Precificação de combustíveis no Brasil: evolução, diferenças regionais e dispersão de preço na revenda</w:t>
+        <w:t>Preço de combustível e peso no orçamento do consumidor: uma comparação entre Brasília e Goiânia</w:t>
       </w:r>
     </w:p>
     <w:p>
@@ -167,7 +167,7 @@
           <w:b w:val="0"/>
           <w:rtl w:val="0"/>
         </w:rPr>
-        <w:t>O estudo é feito sobre o segmento de revenda de combustíveis no Brasil, sob a ótica das distribuidoras que disputam a bomba. As empresas observadas são as que aparecem nomeadas no campo Bandeira do levantamento de preços da ANP: as maiores distribuidoras do país - Vibra Energia (bandeira BR), Ipiranga e Raízen (bandeira Shell) - e o conjunto dos postos de bandeira branca, que não têm contrato de exclusividade com nenhuma delas.</w:t>
+        <w:t>O estudo é feito sobre o segmento de revenda de combustíveis, olhando as empresas que disputam a bomba em duas capitais vizinhas: Brasília e Goiânia. As empresas observadas são as que aparecem nomeadas no campo Bandeira do levantamento de preços da ANP - as maiores distribuidoras do país, Vibra Energia (bandeira BR), Ipiranga e Raízen (bandeira Shell) - e o conjunto dos postos de bandeira branca, que não têm contrato de exclusividade com nenhuma delas.</w:t>
       </w:r>
     </w:p>
     <w:p>
@@ -184,7 +184,7 @@
           <w:b w:val="0"/>
           <w:rtl w:val="0"/>
         </w:rPr>
-        <w:t>A escolha se justifica porque a ANP publica o preço coletado posto a posto com a bandeira de cada revendedor. Isso permite analisar a estratégia de preço de empresas reais, com nome e marca, sem depender de dado proprietário: a base pública já traz a informação que uma área de pricing usaria para monitorar a concorrência.</w:t>
+        <w:t>A escolha se justifica porque a ANP publica o preço coletado posto a posto, com o município e a bandeira de cada revendedor. Isso permite analisar a estratégia de preço de empresas reais, com nome e marca, sem depender de dado proprietário.</w:t>
       </w:r>
     </w:p>
     <w:p>
@@ -198,10 +198,18 @@
       <w:r>
         <w:rPr>
           <w:rFonts w:ascii="Calibri" w:cs="Calibri" w:eastAsia="Calibri" w:hAnsi="Calibri"/>
+          <w:b/>
+          <w:rtl w:val="0"/>
+        </w:rPr>
+        <w:t xml:space="preserve">Para quem o estudo é feito: </w:t>
+      </w:r>
+      <w:r>
+        <w:rPr>
+          <w:rFonts w:ascii="Calibri" w:cs="Calibri" w:eastAsia="Calibri" w:hAnsi="Calibri"/>
           <w:b w:val="0"/>
           <w:rtl w:val="0"/>
         </w:rPr>
-        <w:t>O recorte é nacional, com abertura para o Distrito Federal - mercado onde a dupla mora e cujo comportamento de preço pretende comparar com o das demais unidades da federação.</w:t>
+        <w:t>para a população, o consumidor que abastece. O mesmo dado que uma área de pricing usa para monitorar a concorrência é aqui virado para o outro lado do balcão, para responder três perguntas do dia a dia de quem dirige: onde estou pagando mais caro, quanto eu economizo se pesquisar antes de abastecer, e quanto do meu salário está indo para o tanque. Brasília e Goiânia foram escolhidas por serem capitais vizinhas, com fluxo diário de pessoas entre elas e regimes tributários estaduais distintos - o que torna a comparação concreta para o morador das duas cidades.</w:t>
       </w:r>
     </w:p>
     <w:p>
@@ -262,7 +270,7 @@
           <w:b w:val="0"/>
           <w:rtl w:val="0"/>
         </w:rPr>
-        <w:t>Precificação e Inteligência de Mercado (pricing). É a área que define o preço de bomba, acompanha o preço praticado pela concorrência em cada praça e monitora a posição competitiva da rede.</w:t>
+        <w:t>Precificação e Inteligência de Mercado (pricing), aplicada do ponto de vista do consumidor. O trabalho usa os mesmos indicadores que a área de pricing de uma rede acompanha - preço médio por praça, dispersão entre concorrentes, posição por bandeira - mas para responder onde e quando vale a pena abastecer, e não que preço cobrar.</w:t>
       </w:r>
     </w:p>
     <w:p>
@@ -287,7 +295,7 @@
           <w:b w:val="0"/>
           <w:rtl w:val="0"/>
         </w:rPr>
-        <w:t>Comportamento do preço de revenda de combustíveis no Brasil - gasolina comum, etanol hidratado e diesel S-10. O trabalho vai medir como o preço evoluiu ao longo do tempo, o quanto ele varia entre regiões e unidades da federação, qual é a dispersão de preço dentro de uma mesma cidade, em que condições o etanol se torna vantajoso frente à gasolina e se a bandeira do posto se traduz em diferença consistente de preço.</w:t>
+        <w:t>Preço de revenda de gasolina comum, etanol hidratado e diesel S-10 em Brasília e Goiânia, e o peso desse preço no orçamento das famílias. O trabalho compara as duas capitais do preço mínimo ao máximo coletado, mede quanto se economiza escolhendo o posto certo, calcula que percentual da renda média mensal vai para o combustível em cada uma e verifica em que períodos o etanol compensou frente à gasolina.</w:t>
       </w:r>
     </w:p>
     <w:p>
@@ -312,7 +320,7 @@
           <w:b w:val="0"/>
           <w:rtl w:val="0"/>
         </w:rPr>
-        <w:t>combustível é um preço que todo consumidor acompanha e que toda rede de postos precisa decidir toda semana. A coleta da ANP é semanal, posto a posto, e está publicada desde 2004, o que dá ao projeto uma base com as três dimensões que o Power BI explora bem: geografia (região, UF e município), tempo (data da coleta) e produto/bandeira.</w:t>
+        <w:t>combustível é um preço que todo consumidor acompanha e sobre o qual quase ninguém tem informação organizada na hora de decidir. A coleta da ANP é semanal, posto a posto, e está publicada desde 2004, o que dá ao projeto uma base com as três dimensões que o Power BI explora bem: geografia (região, UF e município), tempo (data da coleta) e produto/bandeira. Cruzada com a renda média do IBGE, ela deixa de ser uma série de preços e vira uma medida de impacto no bolso.</w:t>
       </w:r>
     </w:p>
     <w:p>
@@ -446,7 +454,7 @@
                 <w:bCs w:val="1"/>
                 <w:rtl w:val="0"/>
               </w:rPr>
-              <w:t>Como evoluiu o preço médio de revenda da gasolina comum, do etanol hidratado e do diesel S-10 no Brasil na última década, e quanto dessa alta se sustenta depois de descontada a inflação medida pelo IPCA?</w:t>
+              <w:t>Brasília ou Goiânia: em qual capital o consumidor paga mais caro pelo etanol hidratado e pela gasolina comum? Comparando o preço mínimo, o médio e o máximo coletados em cada semana, qual é a diferença entre as duas cidades em reais por litro?</w:t>
             </w:r>
           </w:p>
         </w:tc>
@@ -475,7 +483,7 @@
                 <w:bCs w:val="1"/>
                 <w:rtl w:val="0"/>
               </w:rPr>
-              <w:t>Quanto o preço do mesmo produto varia entre as regiões e as unidades da federação? Qual é a distância entre a UF mais cara e a mais barata em cada ano, e em que posição desse ranking está o Distrito Federal?</w:t>
+              <w:t>Quanto da renda média mensal de uma família vai para o combustível em cada uma das duas capitais? Tomando um consumo de referência de 100 litros de gasolina por mês - cerca de 1.000 km rodados com um carro que faz 10 km/l - que percentual isso representa do rendimento médio do Distrito Federal e de Goiás, e esse percentual subiu ou caiu na última década?</w:t>
             </w:r>
           </w:p>
         </w:tc>
@@ -504,7 +512,7 @@
                 <w:bCs w:val="1"/>
                 <w:rtl w:val="0"/>
               </w:rPr>
-              <w:t>Qual é a dispersão de preço dentro de um mesmo município na mesma semana de coleta? Em outras palavras: quanto o consumidor economiza, em reais por litro, saindo do posto mais caro para o mais barato da sua cidade?</w:t>
+              <w:t>Quanto o consumidor economiza pesquisando antes de abastecer? Na mesma cidade e na mesma semana de coleta, qual é a diferença entre o posto mais caro e o mais barato, em reais por litro e no custo de um tanque cheio?</w:t>
             </w:r>
           </w:p>
         </w:tc>
@@ -533,7 +541,7 @@
                 <w:bCs w:val="1"/>
                 <w:rtl w:val="0"/>
               </w:rPr>
-              <w:t>Em quais unidades da federação e em quais períodos o etanol hidratado foi vantajoso frente à gasolina comum, usando a regra de paridade de 70% entre os dois preços?</w:t>
+              <w:t>Em quais períodos o etanol hidratado compensou frente à gasolina comum em Brasília e em Goiânia, aplicando a regra de paridade de 70% entre os dois preços? A resposta é a mesma nas duas capitais?</w:t>
             </w:r>
           </w:p>
         </w:tc>
@@ -562,7 +570,36 @@
                 <w:bCs w:val="1"/>
                 <w:rtl w:val="0"/>
               </w:rPr>
-              <w:t>Existe diferença consistente de preço entre as bandeiras (BR, Ipiranga, Shell) e os postos de bandeira branca? A diferença é a mesma em todas as regiões do país?</w:t>
+              <w:t>A bandeira do posto faz diferença no bolso? Postos BR, Ipiranga e Shell cobram de forma consistentemente diferente dos postos de bandeira branca, e essa diferença é igual em Brasília e em Goiânia?</w:t>
+            </w:r>
+          </w:p>
+        </w:tc>
+      </w:tr>
+      <w:tr>
+        <w:trPr>
+          <w:cantSplit w:val="0"/>
+          <w:trHeight w:val="240" w:hRule="atLeast"/>
+          <w:tblHeader w:val="0"/>
+        </w:trPr>
+        <w:tc>
+          <w:tcPr>
+            <w:gridSpan w:val="2"/>
+          </w:tcPr>
+          <w:p>
+            <w:pPr>
+              <w:keepNext w:val="1"/>
+              <w:jc w:val="both"/>
+              <w:rPr>
+                <w:rFonts w:ascii="Calibri" w:cs="Calibri" w:eastAsia="Calibri" w:hAnsi="Calibri"/>
+              </w:rPr>
+            </w:pPr>
+            <w:r>
+              <w:rPr>
+                <w:rFonts w:ascii="Calibri" w:cs="Calibri" w:eastAsia="Calibri" w:hAnsi="Calibri"/>
+                <w:bCs w:val="1"/>
+                <w:rtl w:val="0"/>
+              </w:rPr>
+              <w:t>Quanto da alta do combustível é alta de verdade? Descontada a inflação medida pelo IPCA, o preço real do litro subiu ou caiu na última década nas duas capitais?</w:t>
             </w:r>
           </w:p>
         </w:tc>
@@ -623,7 +660,7 @@
           <w:rFonts w:ascii="Calibri" w:cs="Calibri" w:eastAsia="Calibri" w:hAnsi="Calibri"/>
           <w:rtl w:val="0"/>
         </w:rPr>
-        <w:t>As três bases são públicas, de download livre e sem cadastro. A base principal é o Levantamento de Preços de Combustíveis da ANP, com a coleta semanal do preço praticado em postos revendedores por região, UF, município, produto, data da coleta, valor de venda e bandeira, publicada desde 2004. As outras duas entram como apoio: as vendas de derivados de petróleo e biocombustíveis dão o volume mensal por UF e produto, usado para ponderar as médias de preço pelo tamanho de cada mercado; o IPCA entra como deflator, para separar alta real de combustível de inflação geral. Os arquivos da ANP também estão espelhados no Portal Brasileiro de Dados Abertos (dados.gov.br).</w:t>
+        <w:t>As quatro bases são públicas, de download livre e sem cadastro. A base principal é o Levantamento de Preços de Combustíveis da ANP, com a coleta semanal do preço praticado em postos revendedores por região, UF, município, produto, data da coleta, valor de venda e bandeira, publicada desde 2004 - é dela que saem Brasília e Goiânia, posto a posto. As outras três entram como apoio: as vendas de derivados e biocombustíveis dão o volume por UF e produto, usado para ponderar as médias pelo tamanho de cada mercado; a PNAD Contínua dá o rendimento médio mensal do Distrito Federal e de Goiás, que é o denominador do cálculo do peso no orçamento; e o IPCA entra como deflator, para separar alta real de combustível de inflação geral. Os arquivos da ANP também estão espelhados no Portal Brasileiro de Dados Abertos (dados.gov.br).</w:t>
       </w:r>
     </w:p>
     <w:tbl>
@@ -735,7 +772,7 @@
                 <w:bCs w:val="1"/>
                 <w:rtl w:val="0"/>
               </w:rPr>
-              <w:t>ANP - Série histórica de preços de combustíveis (Levantamento de Preços). Base principal.</w:t>
+              <w:t>ANP - Série histórica de preços de combustíveis (Levantamento de Preços). Base principal: preço posto a posto, por município e bandeira.</w:t>
             </w:r>
           </w:p>
         </w:tc>
@@ -788,7 +825,7 @@
                 <w:bCs w:val="1"/>
                 <w:rtl w:val="0"/>
               </w:rPr>
-              <w:t>ANP - Vendas de derivados de petróleo e biocombustíveis. Base de apoio (volume por UF e produto).</w:t>
+              <w:t>IBGE / SIDRA - PNAD Contínua, tabela 5437. Rendimento médio mensal por UF (DF e GO), usado no cálculo do peso do combustível na renda.</w:t>
             </w:r>
           </w:p>
         </w:tc>
@@ -812,7 +849,7 @@
                   <w:color w:val="0563C1"/>
                   <w:u w:val="single"/>
                 </w:rPr>
-                <w:t>https://www.gov.br/anp/pt-br/centrais-de-conteudo/dados-abertos/vendas-de-derivados-de-petroleo-e-biocombustiveis</w:t>
+                <w:t>https://sidra.ibge.gov.br/tabela/5437</w:t>
               </w:r>
             </w:hyperlink>
           </w:p>
@@ -866,6 +903,59 @@
                   <w:u w:val="single"/>
                 </w:rPr>
                 <w:t>https://sidra.ibge.gov.br/tabela/1737</w:t>
+              </w:r>
+            </w:hyperlink>
+          </w:p>
+        </w:tc>
+      </w:tr>
+      <w:tr>
+        <w:trPr>
+          <w:cantSplit w:val="0"/>
+          <w:tblHeader w:val="0"/>
+        </w:trPr>
+        <w:tc>
+          <w:tcPr>
+            <w:tcW w:type="dxa" w:w="4104"/>
+          </w:tcPr>
+          <w:p>
+            <w:pPr>
+              <w:keepNext w:val="1"/>
+              <w:jc w:val="both"/>
+              <w:rPr>
+                <w:rFonts w:ascii="Calibri" w:cs="Calibri" w:eastAsia="Calibri" w:hAnsi="Calibri"/>
+              </w:rPr>
+            </w:pPr>
+            <w:r>
+              <w:rPr>
+                <w:rFonts w:ascii="Calibri" w:cs="Calibri" w:eastAsia="Calibri" w:hAnsi="Calibri"/>
+                <w:bCs w:val="1"/>
+                <w:rtl w:val="0"/>
+              </w:rPr>
+              <w:t>ANP - Vendas de derivados de petróleo e biocombustíveis. Base de apoio (volume por UF e produto).</w:t>
+            </w:r>
+          </w:p>
+        </w:tc>
+        <w:tc>
+          <w:tcPr>
+            <w:tcW w:type="dxa" w:w="4968"/>
+          </w:tcPr>
+          <w:p>
+            <w:pPr>
+              <w:keepNext w:val="1"/>
+              <w:rPr>
+                <w:rFonts w:ascii="Calibri" w:cs="Calibri" w:eastAsia="Calibri" w:hAnsi="Calibri"/>
+              </w:rPr>
+            </w:pPr>
+            <w:hyperlink r:id="rId11">
+              <w:r>
+                <w:rPr>
+                  <w:rFonts w:ascii="Calibri" w:cs="Calibri" w:eastAsia="Calibri" w:hAnsi="Calibri"/>
+                  <w:bCs w:val="1"/>
+                  <w:rtl w:val="0"/>
+                  <w:color w:val="0563C1"/>
+                  <w:u w:val="single"/>
+                </w:rPr>
+                <w:t>https://www.gov.br/anp/pt-br/centrais-de-conteudo/dados-abertos/vendas-de-derivados-de-petroleo-e-biocombustiveis</w:t>
               </w:r>
             </w:hyperlink>
           </w:p>

</xml_diff>